<commit_message>
Completed Session 2 Exercises 2 through 5 and part of 6
</commit_message>
<xml_diff>
--- a/Session 2/Session 2 Worksheet.docx
+++ b/Session 2/Session 2 Worksheet.docx
@@ -494,6 +494,1362 @@
           <w:lang w:val="en-US"/>
         </w:rPr>
         <w:t>Exercise 2</w:t>
+      </w:r>
+    </w:p>
+    <w:tbl>
+      <w:tblPr>
+        <w:tblStyle w:val="GridTable1Light"/>
+        <w:tblW w:w="0" w:type="auto"/>
+        <w:tblLook w:val="04A0" w:firstRow="1" w:lastRow="0" w:firstColumn="1" w:lastColumn="0" w:noHBand="0" w:noVBand="1"/>
+      </w:tblPr>
+      <w:tblGrid>
+        <w:gridCol w:w="2122"/>
+        <w:gridCol w:w="1701"/>
+        <w:gridCol w:w="5193"/>
+      </w:tblGrid>
+      <w:tr>
+        <w:trPr>
+          <w:cnfStyle w:val="100000000000" w:firstRow="1" w:lastRow="0" w:firstColumn="0" w:lastColumn="0" w:oddVBand="0" w:evenVBand="0" w:oddHBand="0" w:evenHBand="0" w:firstRowFirstColumn="0" w:firstRowLastColumn="0" w:lastRowFirstColumn="0" w:lastRowLastColumn="0"/>
+        </w:trPr>
+        <w:tc>
+          <w:tcPr>
+            <w:cnfStyle w:val="001000000000" w:firstRow="0" w:lastRow="0" w:firstColumn="1" w:lastColumn="0" w:oddVBand="0" w:evenVBand="0" w:oddHBand="0" w:evenHBand="0" w:firstRowFirstColumn="0" w:firstRowLastColumn="0" w:lastRowFirstColumn="0" w:lastRowLastColumn="0"/>
+            <w:tcW w:w="2122" w:type="dxa"/>
+          </w:tcPr>
+          <w:p>
+            <w:pPr>
+              <w:rPr>
+                <w:lang w:val="en-US"/>
+              </w:rPr>
+            </w:pPr>
+            <w:r>
+              <w:rPr>
+                <w:lang w:val="en-US"/>
+              </w:rPr>
+              <w:t>Command</w:t>
+            </w:r>
+          </w:p>
+        </w:tc>
+        <w:tc>
+          <w:tcPr>
+            <w:tcW w:w="1701" w:type="dxa"/>
+          </w:tcPr>
+          <w:p>
+            <w:pPr>
+              <w:cnfStyle w:val="100000000000" w:firstRow="1" w:lastRow="0" w:firstColumn="0" w:lastColumn="0" w:oddVBand="0" w:evenVBand="0" w:oddHBand="0" w:evenHBand="0" w:firstRowFirstColumn="0" w:firstRowLastColumn="0" w:lastRowFirstColumn="0" w:lastRowLastColumn="0"/>
+              <w:rPr>
+                <w:lang w:val="en-US"/>
+              </w:rPr>
+            </w:pPr>
+            <w:r>
+              <w:rPr>
+                <w:lang w:val="en-US"/>
+              </w:rPr>
+              <w:t>Output</w:t>
+            </w:r>
+          </w:p>
+        </w:tc>
+        <w:tc>
+          <w:tcPr>
+            <w:tcW w:w="5193" w:type="dxa"/>
+          </w:tcPr>
+          <w:p>
+            <w:pPr>
+              <w:cnfStyle w:val="100000000000" w:firstRow="1" w:lastRow="0" w:firstColumn="0" w:lastColumn="0" w:oddVBand="0" w:evenVBand="0" w:oddHBand="0" w:evenHBand="0" w:firstRowFirstColumn="0" w:firstRowLastColumn="0" w:lastRowFirstColumn="0" w:lastRowLastColumn="0"/>
+              <w:rPr>
+                <w:lang w:val="en-US"/>
+              </w:rPr>
+            </w:pPr>
+            <w:r>
+              <w:rPr>
+                <w:lang w:val="en-US"/>
+              </w:rPr>
+              <w:t>Notes</w:t>
+            </w:r>
+          </w:p>
+        </w:tc>
+      </w:tr>
+      <w:tr>
+        <w:tc>
+          <w:tcPr>
+            <w:cnfStyle w:val="001000000000" w:firstRow="0" w:lastRow="0" w:firstColumn="1" w:lastColumn="0" w:oddVBand="0" w:evenVBand="0" w:oddHBand="0" w:evenHBand="0" w:firstRowFirstColumn="0" w:firstRowLastColumn="0" w:lastRowFirstColumn="0" w:lastRowLastColumn="0"/>
+            <w:tcW w:w="2122" w:type="dxa"/>
+          </w:tcPr>
+          <w:p>
+            <w:pPr>
+              <w:rPr>
+                <w:b w:val="0"/>
+                <w:bCs w:val="0"/>
+                <w:lang w:val="en-US"/>
+              </w:rPr>
+            </w:pPr>
+            <w:r>
+              <w:rPr>
+                <w:b w:val="0"/>
+                <w:bCs w:val="0"/>
+                <w:lang w:val="en-US"/>
+              </w:rPr>
+              <w:t>int(3.4)</w:t>
+            </w:r>
+          </w:p>
+        </w:tc>
+        <w:tc>
+          <w:tcPr>
+            <w:tcW w:w="1701" w:type="dxa"/>
+          </w:tcPr>
+          <w:p>
+            <w:pPr>
+              <w:cnfStyle w:val="000000000000" w:firstRow="0" w:lastRow="0" w:firstColumn="0" w:lastColumn="0" w:oddVBand="0" w:evenVBand="0" w:oddHBand="0" w:evenHBand="0" w:firstRowFirstColumn="0" w:firstRowLastColumn="0" w:lastRowFirstColumn="0" w:lastRowLastColumn="0"/>
+              <w:rPr>
+                <w:lang w:val="en-US"/>
+              </w:rPr>
+            </w:pPr>
+            <w:r>
+              <w:rPr>
+                <w:lang w:val="en-US"/>
+              </w:rPr>
+              <w:t>3</w:t>
+            </w:r>
+          </w:p>
+        </w:tc>
+        <w:tc>
+          <w:tcPr>
+            <w:tcW w:w="5193" w:type="dxa"/>
+          </w:tcPr>
+          <w:p>
+            <w:pPr>
+              <w:cnfStyle w:val="000000000000" w:firstRow="0" w:lastRow="0" w:firstColumn="0" w:lastColumn="0" w:oddVBand="0" w:evenVBand="0" w:oddHBand="0" w:evenHBand="0" w:firstRowFirstColumn="0" w:firstRowLastColumn="0" w:lastRowFirstColumn="0" w:lastRowLastColumn="0"/>
+              <w:rPr>
+                <w:lang w:val="en-US"/>
+              </w:rPr>
+            </w:pPr>
+            <w:r>
+              <w:rPr>
+                <w:lang w:val="en-US"/>
+              </w:rPr>
+              <w:t>Truncates the decimal portion of the float</w:t>
+            </w:r>
+          </w:p>
+        </w:tc>
+      </w:tr>
+      <w:tr>
+        <w:tc>
+          <w:tcPr>
+            <w:cnfStyle w:val="001000000000" w:firstRow="0" w:lastRow="0" w:firstColumn="1" w:lastColumn="0" w:oddVBand="0" w:evenVBand="0" w:oddHBand="0" w:evenHBand="0" w:firstRowFirstColumn="0" w:firstRowLastColumn="0" w:lastRowFirstColumn="0" w:lastRowLastColumn="0"/>
+            <w:tcW w:w="2122" w:type="dxa"/>
+          </w:tcPr>
+          <w:p>
+            <w:pPr>
+              <w:rPr>
+                <w:b w:val="0"/>
+                <w:bCs w:val="0"/>
+                <w:lang w:val="en-US"/>
+              </w:rPr>
+            </w:pPr>
+            <w:r>
+              <w:rPr>
+                <w:b w:val="0"/>
+                <w:bCs w:val="0"/>
+                <w:lang w:val="en-US"/>
+              </w:rPr>
+              <w:t>float(True)</w:t>
+            </w:r>
+          </w:p>
+        </w:tc>
+        <w:tc>
+          <w:tcPr>
+            <w:tcW w:w="1701" w:type="dxa"/>
+          </w:tcPr>
+          <w:p>
+            <w:pPr>
+              <w:cnfStyle w:val="000000000000" w:firstRow="0" w:lastRow="0" w:firstColumn="0" w:lastColumn="0" w:oddVBand="0" w:evenVBand="0" w:oddHBand="0" w:evenHBand="0" w:firstRowFirstColumn="0" w:firstRowLastColumn="0" w:lastRowFirstColumn="0" w:lastRowLastColumn="0"/>
+              <w:rPr>
+                <w:lang w:val="en-US"/>
+              </w:rPr>
+            </w:pPr>
+            <w:r>
+              <w:rPr>
+                <w:lang w:val="en-US"/>
+              </w:rPr>
+              <w:t>1.0</w:t>
+            </w:r>
+          </w:p>
+        </w:tc>
+        <w:tc>
+          <w:tcPr>
+            <w:tcW w:w="5193" w:type="dxa"/>
+          </w:tcPr>
+          <w:p>
+            <w:pPr>
+              <w:cnfStyle w:val="000000000000" w:firstRow="0" w:lastRow="0" w:firstColumn="0" w:lastColumn="0" w:oddVBand="0" w:evenVBand="0" w:oddHBand="0" w:evenHBand="0" w:firstRowFirstColumn="0" w:firstRowLastColumn="0" w:lastRowFirstColumn="0" w:lastRowLastColumn="0"/>
+              <w:rPr>
+                <w:lang w:val="en-US"/>
+              </w:rPr>
+            </w:pPr>
+            <w:r>
+              <w:rPr>
+                <w:lang w:val="en-US"/>
+              </w:rPr>
+              <w:t>True -&gt; 1 (1.0) as a float</w:t>
+            </w:r>
+          </w:p>
+        </w:tc>
+      </w:tr>
+      <w:tr>
+        <w:tc>
+          <w:tcPr>
+            <w:cnfStyle w:val="001000000000" w:firstRow="0" w:lastRow="0" w:firstColumn="1" w:lastColumn="0" w:oddVBand="0" w:evenVBand="0" w:oddHBand="0" w:evenHBand="0" w:firstRowFirstColumn="0" w:firstRowLastColumn="0" w:lastRowFirstColumn="0" w:lastRowLastColumn="0"/>
+            <w:tcW w:w="2122" w:type="dxa"/>
+          </w:tcPr>
+          <w:p>
+            <w:pPr>
+              <w:rPr>
+                <w:b w:val="0"/>
+                <w:bCs w:val="0"/>
+                <w:lang w:val="en-US"/>
+              </w:rPr>
+            </w:pPr>
+            <w:r>
+              <w:rPr>
+                <w:b w:val="0"/>
+                <w:bCs w:val="0"/>
+                <w:lang w:val="en-US"/>
+              </w:rPr>
+              <w:t>str(False)</w:t>
+            </w:r>
+          </w:p>
+        </w:tc>
+        <w:tc>
+          <w:tcPr>
+            <w:tcW w:w="1701" w:type="dxa"/>
+          </w:tcPr>
+          <w:p>
+            <w:pPr>
+              <w:cnfStyle w:val="000000000000" w:firstRow="0" w:lastRow="0" w:firstColumn="0" w:lastColumn="0" w:oddVBand="0" w:evenVBand="0" w:oddHBand="0" w:evenHBand="0" w:firstRowFirstColumn="0" w:firstRowLastColumn="0" w:lastRowFirstColumn="0" w:lastRowLastColumn="0"/>
+              <w:rPr>
+                <w:lang w:val="en-US"/>
+              </w:rPr>
+            </w:pPr>
+            <w:r>
+              <w:rPr>
+                <w:lang w:val="en-US"/>
+              </w:rPr>
+              <w:t>“False”</w:t>
+            </w:r>
+          </w:p>
+        </w:tc>
+        <w:tc>
+          <w:tcPr>
+            <w:tcW w:w="5193" w:type="dxa"/>
+          </w:tcPr>
+          <w:p>
+            <w:pPr>
+              <w:cnfStyle w:val="000000000000" w:firstRow="0" w:lastRow="0" w:firstColumn="0" w:lastColumn="0" w:oddVBand="0" w:evenVBand="0" w:oddHBand="0" w:evenHBand="0" w:firstRowFirstColumn="0" w:firstRowLastColumn="0" w:lastRowFirstColumn="0" w:lastRowLastColumn="0"/>
+              <w:rPr>
+                <w:lang w:val="en-US"/>
+              </w:rPr>
+            </w:pPr>
+            <w:r>
+              <w:rPr>
+                <w:lang w:val="en-US"/>
+              </w:rPr>
+              <w:t>False as a string</w:t>
+            </w:r>
+          </w:p>
+        </w:tc>
+      </w:tr>
+      <w:tr>
+        <w:tc>
+          <w:tcPr>
+            <w:cnfStyle w:val="001000000000" w:firstRow="0" w:lastRow="0" w:firstColumn="1" w:lastColumn="0" w:oddVBand="0" w:evenVBand="0" w:oddHBand="0" w:evenHBand="0" w:firstRowFirstColumn="0" w:firstRowLastColumn="0" w:lastRowFirstColumn="0" w:lastRowLastColumn="0"/>
+            <w:tcW w:w="2122" w:type="dxa"/>
+          </w:tcPr>
+          <w:p>
+            <w:pPr>
+              <w:rPr>
+                <w:b w:val="0"/>
+                <w:bCs w:val="0"/>
+                <w:lang w:val="en-US"/>
+              </w:rPr>
+            </w:pPr>
+            <w:r>
+              <w:rPr>
+                <w:b w:val="0"/>
+                <w:bCs w:val="0"/>
+                <w:lang w:val="en-US"/>
+              </w:rPr>
+              <w:t>bool(3)</w:t>
+            </w:r>
+          </w:p>
+        </w:tc>
+        <w:tc>
+          <w:tcPr>
+            <w:tcW w:w="1701" w:type="dxa"/>
+          </w:tcPr>
+          <w:p>
+            <w:pPr>
+              <w:cnfStyle w:val="000000000000" w:firstRow="0" w:lastRow="0" w:firstColumn="0" w:lastColumn="0" w:oddVBand="0" w:evenVBand="0" w:oddHBand="0" w:evenHBand="0" w:firstRowFirstColumn="0" w:firstRowLastColumn="0" w:lastRowFirstColumn="0" w:lastRowLastColumn="0"/>
+              <w:rPr>
+                <w:lang w:val="en-US"/>
+              </w:rPr>
+            </w:pPr>
+            <w:r>
+              <w:rPr>
+                <w:lang w:val="en-US"/>
+              </w:rPr>
+              <w:t>True</w:t>
+            </w:r>
+          </w:p>
+        </w:tc>
+        <w:tc>
+          <w:tcPr>
+            <w:tcW w:w="5193" w:type="dxa"/>
+          </w:tcPr>
+          <w:p>
+            <w:pPr>
+              <w:cnfStyle w:val="000000000000" w:firstRow="0" w:lastRow="0" w:firstColumn="0" w:lastColumn="0" w:oddVBand="0" w:evenVBand="0" w:oddHBand="0" w:evenHBand="0" w:firstRowFirstColumn="0" w:firstRowLastColumn="0" w:lastRowFirstColumn="0" w:lastRowLastColumn="0"/>
+              <w:rPr>
+                <w:lang w:val="en-US"/>
+              </w:rPr>
+            </w:pPr>
+            <w:r>
+              <w:rPr>
+                <w:lang w:val="en-US"/>
+              </w:rPr>
+              <w:t>3 is not 0 thus True</w:t>
+            </w:r>
+          </w:p>
+        </w:tc>
+      </w:tr>
+      <w:tr>
+        <w:trPr>
+          <w:trHeight w:val="86"/>
+        </w:trPr>
+        <w:tc>
+          <w:tcPr>
+            <w:cnfStyle w:val="001000000000" w:firstRow="0" w:lastRow="0" w:firstColumn="1" w:lastColumn="0" w:oddVBand="0" w:evenVBand="0" w:oddHBand="0" w:evenHBand="0" w:firstRowFirstColumn="0" w:firstRowLastColumn="0" w:lastRowFirstColumn="0" w:lastRowLastColumn="0"/>
+            <w:tcW w:w="2122" w:type="dxa"/>
+          </w:tcPr>
+          <w:p>
+            <w:pPr>
+              <w:rPr>
+                <w:b w:val="0"/>
+                <w:bCs w:val="0"/>
+                <w:lang w:val="en-US"/>
+              </w:rPr>
+            </w:pPr>
+            <w:r>
+              <w:rPr>
+                <w:b w:val="0"/>
+                <w:bCs w:val="0"/>
+                <w:lang w:val="en-US"/>
+              </w:rPr>
+              <w:t>bool(5.1)</w:t>
+            </w:r>
+          </w:p>
+        </w:tc>
+        <w:tc>
+          <w:tcPr>
+            <w:tcW w:w="1701" w:type="dxa"/>
+          </w:tcPr>
+          <w:p>
+            <w:pPr>
+              <w:cnfStyle w:val="000000000000" w:firstRow="0" w:lastRow="0" w:firstColumn="0" w:lastColumn="0" w:oddVBand="0" w:evenVBand="0" w:oddHBand="0" w:evenHBand="0" w:firstRowFirstColumn="0" w:firstRowLastColumn="0" w:lastRowFirstColumn="0" w:lastRowLastColumn="0"/>
+              <w:rPr>
+                <w:lang w:val="en-US"/>
+              </w:rPr>
+            </w:pPr>
+            <w:r>
+              <w:rPr>
+                <w:lang w:val="en-US"/>
+              </w:rPr>
+              <w:t>True</w:t>
+            </w:r>
+          </w:p>
+        </w:tc>
+        <w:tc>
+          <w:tcPr>
+            <w:tcW w:w="5193" w:type="dxa"/>
+          </w:tcPr>
+          <w:p>
+            <w:pPr>
+              <w:cnfStyle w:val="000000000000" w:firstRow="0" w:lastRow="0" w:firstColumn="0" w:lastColumn="0" w:oddVBand="0" w:evenVBand="0" w:oddHBand="0" w:evenHBand="0" w:firstRowFirstColumn="0" w:firstRowLastColumn="0" w:lastRowFirstColumn="0" w:lastRowLastColumn="0"/>
+              <w:rPr>
+                <w:lang w:val="en-US"/>
+              </w:rPr>
+            </w:pPr>
+            <w:r>
+              <w:rPr>
+                <w:lang w:val="en-US"/>
+              </w:rPr>
+              <w:t>5.1 is not 0 thus True</w:t>
+            </w:r>
+          </w:p>
+        </w:tc>
+      </w:tr>
+      <w:tr>
+        <w:tc>
+          <w:tcPr>
+            <w:cnfStyle w:val="001000000000" w:firstRow="0" w:lastRow="0" w:firstColumn="1" w:lastColumn="0" w:oddVBand="0" w:evenVBand="0" w:oddHBand="0" w:evenHBand="0" w:firstRowFirstColumn="0" w:firstRowLastColumn="0" w:lastRowFirstColumn="0" w:lastRowLastColumn="0"/>
+            <w:tcW w:w="2122" w:type="dxa"/>
+          </w:tcPr>
+          <w:p>
+            <w:pPr>
+              <w:rPr>
+                <w:b w:val="0"/>
+                <w:bCs w:val="0"/>
+                <w:lang w:val="en-US"/>
+              </w:rPr>
+            </w:pPr>
+            <w:r>
+              <w:rPr>
+                <w:b w:val="0"/>
+                <w:bCs w:val="0"/>
+                <w:lang w:val="en-US"/>
+              </w:rPr>
+              <w:t>float(7)</w:t>
+            </w:r>
+          </w:p>
+        </w:tc>
+        <w:tc>
+          <w:tcPr>
+            <w:tcW w:w="1701" w:type="dxa"/>
+          </w:tcPr>
+          <w:p>
+            <w:pPr>
+              <w:cnfStyle w:val="000000000000" w:firstRow="0" w:lastRow="0" w:firstColumn="0" w:lastColumn="0" w:oddVBand="0" w:evenVBand="0" w:oddHBand="0" w:evenHBand="0" w:firstRowFirstColumn="0" w:firstRowLastColumn="0" w:lastRowFirstColumn="0" w:lastRowLastColumn="0"/>
+              <w:rPr>
+                <w:lang w:val="en-US"/>
+              </w:rPr>
+            </w:pPr>
+            <w:r>
+              <w:rPr>
+                <w:lang w:val="en-US"/>
+              </w:rPr>
+              <w:t>7.0</w:t>
+            </w:r>
+          </w:p>
+        </w:tc>
+        <w:tc>
+          <w:tcPr>
+            <w:tcW w:w="5193" w:type="dxa"/>
+          </w:tcPr>
+          <w:p>
+            <w:pPr>
+              <w:cnfStyle w:val="000000000000" w:firstRow="0" w:lastRow="0" w:firstColumn="0" w:lastColumn="0" w:oddVBand="0" w:evenVBand="0" w:oddHBand="0" w:evenHBand="0" w:firstRowFirstColumn="0" w:firstRowLastColumn="0" w:lastRowFirstColumn="0" w:lastRowLastColumn="0"/>
+              <w:rPr>
+                <w:lang w:val="en-US"/>
+              </w:rPr>
+            </w:pPr>
+            <w:r>
+              <w:rPr>
+                <w:lang w:val="en-US"/>
+              </w:rPr>
+              <w:t>Appends .0 to indicate that it is a float</w:t>
+            </w:r>
+          </w:p>
+        </w:tc>
+      </w:tr>
+    </w:tbl>
+    <w:p>
+      <w:pPr>
+        <w:pStyle w:val="Heading2"/>
+        <w:rPr>
+          <w:lang w:val="en-US"/>
+        </w:rPr>
+      </w:pPr>
+      <w:r>
+        <w:rPr>
+          <w:lang w:val="en-US"/>
+        </w:rPr>
+        <w:t>Exercise 3</w:t>
+      </w:r>
+    </w:p>
+    <w:p>
+      <w:pPr>
+        <w:rPr>
+          <w:lang w:val="en-US"/>
+        </w:rPr>
+      </w:pPr>
+      <w:r>
+        <w:rPr>
+          <w:lang w:val="en-US"/>
+        </w:rPr>
+        <w:t>x = 2</w:t>
+      </w:r>
+    </w:p>
+    <w:p>
+      <w:pPr>
+        <w:rPr>
+          <w:lang w:val="en-US"/>
+        </w:rPr>
+      </w:pPr>
+      <w:r>
+        <w:rPr>
+          <w:lang w:val="en-US"/>
+        </w:rPr>
+        <w:t>y = 5.7</w:t>
+      </w:r>
+    </w:p>
+    <w:p>
+      <w:pPr>
+        <w:rPr>
+          <w:lang w:val="en-US"/>
+        </w:rPr>
+      </w:pPr>
+      <w:r>
+        <w:rPr>
+          <w:lang w:val="en-US"/>
+        </w:rPr>
+        <w:t>z = -8</w:t>
+      </w:r>
+    </w:p>
+    <w:tbl>
+      <w:tblPr>
+        <w:tblStyle w:val="GridTable1Light"/>
+        <w:tblW w:w="0" w:type="auto"/>
+        <w:tblLook w:val="04A0" w:firstRow="1" w:lastRow="0" w:firstColumn="1" w:lastColumn="0" w:noHBand="0" w:noVBand="1"/>
+      </w:tblPr>
+      <w:tblGrid>
+        <w:gridCol w:w="2263"/>
+        <w:gridCol w:w="1560"/>
+        <w:gridCol w:w="5193"/>
+      </w:tblGrid>
+      <w:tr>
+        <w:trPr>
+          <w:cnfStyle w:val="100000000000" w:firstRow="1" w:lastRow="0" w:firstColumn="0" w:lastColumn="0" w:oddVBand="0" w:evenVBand="0" w:oddHBand="0" w:evenHBand="0" w:firstRowFirstColumn="0" w:firstRowLastColumn="0" w:lastRowFirstColumn="0" w:lastRowLastColumn="0"/>
+        </w:trPr>
+        <w:tc>
+          <w:tcPr>
+            <w:cnfStyle w:val="001000000000" w:firstRow="0" w:lastRow="0" w:firstColumn="1" w:lastColumn="0" w:oddVBand="0" w:evenVBand="0" w:oddHBand="0" w:evenHBand="0" w:firstRowFirstColumn="0" w:firstRowLastColumn="0" w:lastRowFirstColumn="0" w:lastRowLastColumn="0"/>
+            <w:tcW w:w="2263" w:type="dxa"/>
+          </w:tcPr>
+          <w:p>
+            <w:pPr>
+              <w:rPr>
+                <w:lang w:val="en-US"/>
+              </w:rPr>
+            </w:pPr>
+            <w:r>
+              <w:rPr>
+                <w:lang w:val="en-US"/>
+              </w:rPr>
+              <w:t>Command</w:t>
+            </w:r>
+          </w:p>
+        </w:tc>
+        <w:tc>
+          <w:tcPr>
+            <w:tcW w:w="1560" w:type="dxa"/>
+          </w:tcPr>
+          <w:p>
+            <w:pPr>
+              <w:cnfStyle w:val="100000000000" w:firstRow="1" w:lastRow="0" w:firstColumn="0" w:lastColumn="0" w:oddVBand="0" w:evenVBand="0" w:oddHBand="0" w:evenHBand="0" w:firstRowFirstColumn="0" w:firstRowLastColumn="0" w:lastRowFirstColumn="0" w:lastRowLastColumn="0"/>
+              <w:rPr>
+                <w:lang w:val="en-US"/>
+              </w:rPr>
+            </w:pPr>
+            <w:r>
+              <w:rPr>
+                <w:lang w:val="en-US"/>
+              </w:rPr>
+              <w:t>Output</w:t>
+            </w:r>
+          </w:p>
+        </w:tc>
+        <w:tc>
+          <w:tcPr>
+            <w:tcW w:w="5193" w:type="dxa"/>
+          </w:tcPr>
+          <w:p>
+            <w:pPr>
+              <w:cnfStyle w:val="100000000000" w:firstRow="1" w:lastRow="0" w:firstColumn="0" w:lastColumn="0" w:oddVBand="0" w:evenVBand="0" w:oddHBand="0" w:evenHBand="0" w:firstRowFirstColumn="0" w:firstRowLastColumn="0" w:lastRowFirstColumn="0" w:lastRowLastColumn="0"/>
+              <w:rPr>
+                <w:lang w:val="en-US"/>
+              </w:rPr>
+            </w:pPr>
+            <w:r>
+              <w:rPr>
+                <w:lang w:val="en-US"/>
+              </w:rPr>
+              <w:t>Notes</w:t>
+            </w:r>
+          </w:p>
+        </w:tc>
+      </w:tr>
+      <w:tr>
+        <w:tc>
+          <w:tcPr>
+            <w:cnfStyle w:val="001000000000" w:firstRow="0" w:lastRow="0" w:firstColumn="1" w:lastColumn="0" w:oddVBand="0" w:evenVBand="0" w:oddHBand="0" w:evenHBand="0" w:firstRowFirstColumn="0" w:firstRowLastColumn="0" w:lastRowFirstColumn="0" w:lastRowLastColumn="0"/>
+            <w:tcW w:w="2263" w:type="dxa"/>
+          </w:tcPr>
+          <w:p>
+            <w:pPr>
+              <w:rPr>
+                <w:b w:val="0"/>
+                <w:bCs w:val="0"/>
+                <w:lang w:val="en-US"/>
+              </w:rPr>
+            </w:pPr>
+            <w:r>
+              <w:rPr>
+                <w:b w:val="0"/>
+                <w:bCs w:val="0"/>
+                <w:lang w:val="en-US"/>
+              </w:rPr>
+              <w:t>x + 2 * y</w:t>
+            </w:r>
+          </w:p>
+        </w:tc>
+        <w:tc>
+          <w:tcPr>
+            <w:tcW w:w="1560" w:type="dxa"/>
+          </w:tcPr>
+          <w:p>
+            <w:pPr>
+              <w:cnfStyle w:val="000000000000" w:firstRow="0" w:lastRow="0" w:firstColumn="0" w:lastColumn="0" w:oddVBand="0" w:evenVBand="0" w:oddHBand="0" w:evenHBand="0" w:firstRowFirstColumn="0" w:firstRowLastColumn="0" w:lastRowFirstColumn="0" w:lastRowLastColumn="0"/>
+              <w:rPr>
+                <w:lang w:val="en-US"/>
+              </w:rPr>
+            </w:pPr>
+            <w:r>
+              <w:rPr>
+                <w:lang w:val="en-US"/>
+              </w:rPr>
+              <w:t>13.4</w:t>
+            </w:r>
+          </w:p>
+        </w:tc>
+        <w:tc>
+          <w:tcPr>
+            <w:tcW w:w="5193" w:type="dxa"/>
+          </w:tcPr>
+          <w:p>
+            <w:pPr>
+              <w:cnfStyle w:val="000000000000" w:firstRow="0" w:lastRow="0" w:firstColumn="0" w:lastColumn="0" w:oddVBand="0" w:evenVBand="0" w:oddHBand="0" w:evenHBand="0" w:firstRowFirstColumn="0" w:firstRowLastColumn="0" w:lastRowFirstColumn="0" w:lastRowLastColumn="0"/>
+              <w:rPr>
+                <w:lang w:val="en-US"/>
+              </w:rPr>
+            </w:pPr>
+            <w:r>
+              <w:rPr>
+                <w:lang w:val="en-US"/>
+              </w:rPr>
+              <w:t>x + (2 * y) using correct order of operations</w:t>
+            </w:r>
+          </w:p>
+        </w:tc>
+      </w:tr>
+      <w:tr>
+        <w:tc>
+          <w:tcPr>
+            <w:cnfStyle w:val="001000000000" w:firstRow="0" w:lastRow="0" w:firstColumn="1" w:lastColumn="0" w:oddVBand="0" w:evenVBand="0" w:oddHBand="0" w:evenHBand="0" w:firstRowFirstColumn="0" w:firstRowLastColumn="0" w:lastRowFirstColumn="0" w:lastRowLastColumn="0"/>
+            <w:tcW w:w="2263" w:type="dxa"/>
+          </w:tcPr>
+          <w:p>
+            <w:pPr>
+              <w:rPr>
+                <w:b w:val="0"/>
+                <w:bCs w:val="0"/>
+                <w:lang w:val="en-US"/>
+              </w:rPr>
+            </w:pPr>
+            <w:r>
+              <w:rPr>
+                <w:b w:val="0"/>
+                <w:bCs w:val="0"/>
+                <w:lang w:val="en-US"/>
+              </w:rPr>
+              <w:t>z % x</w:t>
+            </w:r>
+          </w:p>
+        </w:tc>
+        <w:tc>
+          <w:tcPr>
+            <w:tcW w:w="1560" w:type="dxa"/>
+          </w:tcPr>
+          <w:p>
+            <w:pPr>
+              <w:cnfStyle w:val="000000000000" w:firstRow="0" w:lastRow="0" w:firstColumn="0" w:lastColumn="0" w:oddVBand="0" w:evenVBand="0" w:oddHBand="0" w:evenHBand="0" w:firstRowFirstColumn="0" w:firstRowLastColumn="0" w:lastRowFirstColumn="0" w:lastRowLastColumn="0"/>
+              <w:rPr>
+                <w:lang w:val="en-US"/>
+              </w:rPr>
+            </w:pPr>
+            <w:r>
+              <w:rPr>
+                <w:lang w:val="en-US"/>
+              </w:rPr>
+              <w:t>0</w:t>
+            </w:r>
+          </w:p>
+        </w:tc>
+        <w:tc>
+          <w:tcPr>
+            <w:tcW w:w="5193" w:type="dxa"/>
+          </w:tcPr>
+          <w:p>
+            <w:pPr>
+              <w:cnfStyle w:val="000000000000" w:firstRow="0" w:lastRow="0" w:firstColumn="0" w:lastColumn="0" w:oddVBand="0" w:evenVBand="0" w:oddHBand="0" w:evenHBand="0" w:firstRowFirstColumn="0" w:firstRowLastColumn="0" w:lastRowFirstColumn="0" w:lastRowLastColumn="0"/>
+              <w:rPr>
+                <w:lang w:val="en-US"/>
+              </w:rPr>
+            </w:pPr>
+            <w:r>
+              <w:rPr>
+                <w:lang w:val="en-US"/>
+              </w:rPr>
+              <w:t>No remainder when dividing -8 by 2</w:t>
+            </w:r>
+          </w:p>
+        </w:tc>
+      </w:tr>
+      <w:tr>
+        <w:tc>
+          <w:tcPr>
+            <w:cnfStyle w:val="001000000000" w:firstRow="0" w:lastRow="0" w:firstColumn="1" w:lastColumn="0" w:oddVBand="0" w:evenVBand="0" w:oddHBand="0" w:evenHBand="0" w:firstRowFirstColumn="0" w:firstRowLastColumn="0" w:lastRowFirstColumn="0" w:lastRowLastColumn="0"/>
+            <w:tcW w:w="2263" w:type="dxa"/>
+          </w:tcPr>
+          <w:p>
+            <w:pPr>
+              <w:rPr>
+                <w:b w:val="0"/>
+                <w:bCs w:val="0"/>
+                <w:lang w:val="en-US"/>
+              </w:rPr>
+            </w:pPr>
+            <w:r>
+              <w:rPr>
+                <w:b w:val="0"/>
+                <w:bCs w:val="0"/>
+                <w:lang w:val="en-US"/>
+              </w:rPr>
+              <w:t>y ** x</w:t>
+            </w:r>
+          </w:p>
+        </w:tc>
+        <w:tc>
+          <w:tcPr>
+            <w:tcW w:w="1560" w:type="dxa"/>
+          </w:tcPr>
+          <w:p>
+            <w:pPr>
+              <w:cnfStyle w:val="000000000000" w:firstRow="0" w:lastRow="0" w:firstColumn="0" w:lastColumn="0" w:oddVBand="0" w:evenVBand="0" w:oddHBand="0" w:evenHBand="0" w:firstRowFirstColumn="0" w:firstRowLastColumn="0" w:lastRowFirstColumn="0" w:lastRowLastColumn="0"/>
+              <w:rPr>
+                <w:lang w:val="en-US"/>
+              </w:rPr>
+            </w:pPr>
+            <w:r>
+              <w:rPr>
+                <w:lang w:val="en-US"/>
+              </w:rPr>
+              <w:t>32.49</w:t>
+            </w:r>
+          </w:p>
+        </w:tc>
+        <w:tc>
+          <w:tcPr>
+            <w:tcW w:w="5193" w:type="dxa"/>
+          </w:tcPr>
+          <w:p>
+            <w:pPr>
+              <w:cnfStyle w:val="000000000000" w:firstRow="0" w:lastRow="0" w:firstColumn="0" w:lastColumn="0" w:oddVBand="0" w:evenVBand="0" w:oddHBand="0" w:evenHBand="0" w:firstRowFirstColumn="0" w:firstRowLastColumn="0" w:lastRowFirstColumn="0" w:lastRowLastColumn="0"/>
+              <w:rPr>
+                <w:lang w:val="en-US"/>
+              </w:rPr>
+            </w:pPr>
+            <w:r>
+              <w:rPr>
+                <w:lang w:val="en-US"/>
+              </w:rPr>
+              <w:t>5.7 ^ 2 (5.7 squared)</w:t>
+            </w:r>
+          </w:p>
+        </w:tc>
+      </w:tr>
+      <w:tr>
+        <w:tc>
+          <w:tcPr>
+            <w:cnfStyle w:val="001000000000" w:firstRow="0" w:lastRow="0" w:firstColumn="1" w:lastColumn="0" w:oddVBand="0" w:evenVBand="0" w:oddHBand="0" w:evenHBand="0" w:firstRowFirstColumn="0" w:firstRowLastColumn="0" w:lastRowFirstColumn="0" w:lastRowLastColumn="0"/>
+            <w:tcW w:w="2263" w:type="dxa"/>
+          </w:tcPr>
+          <w:p>
+            <w:pPr>
+              <w:rPr>
+                <w:b w:val="0"/>
+                <w:bCs w:val="0"/>
+                <w:lang w:val="en-US"/>
+              </w:rPr>
+            </w:pPr>
+            <w:r>
+              <w:rPr>
+                <w:b w:val="0"/>
+                <w:bCs w:val="0"/>
+                <w:lang w:val="en-US"/>
+              </w:rPr>
+              <w:t>z – True</w:t>
+            </w:r>
+          </w:p>
+        </w:tc>
+        <w:tc>
+          <w:tcPr>
+            <w:tcW w:w="1560" w:type="dxa"/>
+          </w:tcPr>
+          <w:p>
+            <w:pPr>
+              <w:cnfStyle w:val="000000000000" w:firstRow="0" w:lastRow="0" w:firstColumn="0" w:lastColumn="0" w:oddVBand="0" w:evenVBand="0" w:oddHBand="0" w:evenHBand="0" w:firstRowFirstColumn="0" w:firstRowLastColumn="0" w:lastRowFirstColumn="0" w:lastRowLastColumn="0"/>
+              <w:rPr>
+                <w:lang w:val="en-US"/>
+              </w:rPr>
+            </w:pPr>
+            <w:r>
+              <w:rPr>
+                <w:lang w:val="en-US"/>
+              </w:rPr>
+              <w:t>-9</w:t>
+            </w:r>
+          </w:p>
+        </w:tc>
+        <w:tc>
+          <w:tcPr>
+            <w:tcW w:w="5193" w:type="dxa"/>
+          </w:tcPr>
+          <w:p>
+            <w:pPr>
+              <w:cnfStyle w:val="000000000000" w:firstRow="0" w:lastRow="0" w:firstColumn="0" w:lastColumn="0" w:oddVBand="0" w:evenVBand="0" w:oddHBand="0" w:evenHBand="0" w:firstRowFirstColumn="0" w:firstRowLastColumn="0" w:lastRowFirstColumn="0" w:lastRowLastColumn="0"/>
+              <w:rPr>
+                <w:lang w:val="en-US"/>
+              </w:rPr>
+            </w:pPr>
+            <w:r>
+              <w:rPr>
+                <w:lang w:val="en-US"/>
+              </w:rPr>
+              <w:t>-8 – 1 since int(True) = 1</w:t>
+            </w:r>
+          </w:p>
+        </w:tc>
+      </w:tr>
+      <w:tr>
+        <w:tc>
+          <w:tcPr>
+            <w:cnfStyle w:val="001000000000" w:firstRow="0" w:lastRow="0" w:firstColumn="1" w:lastColumn="0" w:oddVBand="0" w:evenVBand="0" w:oddHBand="0" w:evenHBand="0" w:firstRowFirstColumn="0" w:firstRowLastColumn="0" w:lastRowFirstColumn="0" w:lastRowLastColumn="0"/>
+            <w:tcW w:w="2263" w:type="dxa"/>
+          </w:tcPr>
+          <w:p>
+            <w:pPr>
+              <w:rPr>
+                <w:b w:val="0"/>
+                <w:bCs w:val="0"/>
+                <w:lang w:val="en-US"/>
+              </w:rPr>
+            </w:pPr>
+            <w:r>
+              <w:rPr>
+                <w:b w:val="0"/>
+                <w:bCs w:val="0"/>
+                <w:lang w:val="en-US"/>
+              </w:rPr>
+              <w:t>z &gt;= x</w:t>
+            </w:r>
+          </w:p>
+        </w:tc>
+        <w:tc>
+          <w:tcPr>
+            <w:tcW w:w="1560" w:type="dxa"/>
+          </w:tcPr>
+          <w:p>
+            <w:pPr>
+              <w:cnfStyle w:val="000000000000" w:firstRow="0" w:lastRow="0" w:firstColumn="0" w:lastColumn="0" w:oddVBand="0" w:evenVBand="0" w:oddHBand="0" w:evenHBand="0" w:firstRowFirstColumn="0" w:firstRowLastColumn="0" w:lastRowFirstColumn="0" w:lastRowLastColumn="0"/>
+              <w:rPr>
+                <w:lang w:val="en-US"/>
+              </w:rPr>
+            </w:pPr>
+            <w:r>
+              <w:rPr>
+                <w:lang w:val="en-US"/>
+              </w:rPr>
+              <w:t>False</w:t>
+            </w:r>
+          </w:p>
+        </w:tc>
+        <w:tc>
+          <w:tcPr>
+            <w:tcW w:w="5193" w:type="dxa"/>
+          </w:tcPr>
+          <w:p>
+            <w:pPr>
+              <w:cnfStyle w:val="000000000000" w:firstRow="0" w:lastRow="0" w:firstColumn="0" w:lastColumn="0" w:oddVBand="0" w:evenVBand="0" w:oddHBand="0" w:evenHBand="0" w:firstRowFirstColumn="0" w:firstRowLastColumn="0" w:lastRowFirstColumn="0" w:lastRowLastColumn="0"/>
+              <w:rPr>
+                <w:lang w:val="en-US"/>
+              </w:rPr>
+            </w:pPr>
+            <w:r>
+              <w:rPr>
+                <w:lang w:val="en-US"/>
+              </w:rPr>
+              <w:t>-8 is not greater than or equal to 2</w:t>
+            </w:r>
+          </w:p>
+        </w:tc>
+      </w:tr>
+      <w:tr>
+        <w:tc>
+          <w:tcPr>
+            <w:cnfStyle w:val="001000000000" w:firstRow="0" w:lastRow="0" w:firstColumn="1" w:lastColumn="0" w:oddVBand="0" w:evenVBand="0" w:oddHBand="0" w:evenHBand="0" w:firstRowFirstColumn="0" w:firstRowLastColumn="0" w:lastRowFirstColumn="0" w:lastRowLastColumn="0"/>
+            <w:tcW w:w="2263" w:type="dxa"/>
+          </w:tcPr>
+          <w:p>
+            <w:pPr>
+              <w:rPr>
+                <w:b w:val="0"/>
+                <w:bCs w:val="0"/>
+                <w:lang w:val="en-US"/>
+              </w:rPr>
+            </w:pPr>
+            <w:r>
+              <w:rPr>
+                <w:b w:val="0"/>
+                <w:bCs w:val="0"/>
+                <w:lang w:val="en-US"/>
+              </w:rPr>
+              <w:t>y != x</w:t>
+            </w:r>
+          </w:p>
+        </w:tc>
+        <w:tc>
+          <w:tcPr>
+            <w:tcW w:w="1560" w:type="dxa"/>
+          </w:tcPr>
+          <w:p>
+            <w:pPr>
+              <w:cnfStyle w:val="000000000000" w:firstRow="0" w:lastRow="0" w:firstColumn="0" w:lastColumn="0" w:oddVBand="0" w:evenVBand="0" w:oddHBand="0" w:evenHBand="0" w:firstRowFirstColumn="0" w:firstRowLastColumn="0" w:lastRowFirstColumn="0" w:lastRowLastColumn="0"/>
+              <w:rPr>
+                <w:lang w:val="en-US"/>
+              </w:rPr>
+            </w:pPr>
+            <w:r>
+              <w:rPr>
+                <w:lang w:val="en-US"/>
+              </w:rPr>
+              <w:t>True</w:t>
+            </w:r>
+          </w:p>
+        </w:tc>
+        <w:tc>
+          <w:tcPr>
+            <w:tcW w:w="5193" w:type="dxa"/>
+          </w:tcPr>
+          <w:p>
+            <w:pPr>
+              <w:cnfStyle w:val="000000000000" w:firstRow="0" w:lastRow="0" w:firstColumn="0" w:lastColumn="0" w:oddVBand="0" w:evenVBand="0" w:oddHBand="0" w:evenHBand="0" w:firstRowFirstColumn="0" w:firstRowLastColumn="0" w:lastRowFirstColumn="0" w:lastRowLastColumn="0"/>
+              <w:rPr>
+                <w:lang w:val="en-US"/>
+              </w:rPr>
+            </w:pPr>
+            <w:r>
+              <w:rPr>
+                <w:lang w:val="en-US"/>
+              </w:rPr>
+              <w:t xml:space="preserve">5.7 isn’t equal to </w:t>
+            </w:r>
+            <w:r>
+              <w:rPr>
+                <w:lang w:val="en-US"/>
+              </w:rPr>
+              <w:t>2</w:t>
+            </w:r>
+          </w:p>
+        </w:tc>
+      </w:tr>
+      <w:tr>
+        <w:tc>
+          <w:tcPr>
+            <w:cnfStyle w:val="001000000000" w:firstRow="0" w:lastRow="0" w:firstColumn="1" w:lastColumn="0" w:oddVBand="0" w:evenVBand="0" w:oddHBand="0" w:evenHBand="0" w:firstRowFirstColumn="0" w:firstRowLastColumn="0" w:lastRowFirstColumn="0" w:lastRowLastColumn="0"/>
+            <w:tcW w:w="2263" w:type="dxa"/>
+          </w:tcPr>
+          <w:p>
+            <w:pPr>
+              <w:rPr>
+                <w:b w:val="0"/>
+                <w:bCs w:val="0"/>
+                <w:lang w:val="en-US"/>
+              </w:rPr>
+            </w:pPr>
+            <w:r>
+              <w:rPr>
+                <w:b w:val="0"/>
+                <w:bCs w:val="0"/>
+                <w:lang w:val="en-US"/>
+              </w:rPr>
+              <w:t>x &gt;= 1 and y == 6</w:t>
+            </w:r>
+          </w:p>
+        </w:tc>
+        <w:tc>
+          <w:tcPr>
+            <w:tcW w:w="1560" w:type="dxa"/>
+          </w:tcPr>
+          <w:p>
+            <w:pPr>
+              <w:cnfStyle w:val="000000000000" w:firstRow="0" w:lastRow="0" w:firstColumn="0" w:lastColumn="0" w:oddVBand="0" w:evenVBand="0" w:oddHBand="0" w:evenHBand="0" w:firstRowFirstColumn="0" w:firstRowLastColumn="0" w:lastRowFirstColumn="0" w:lastRowLastColumn="0"/>
+              <w:rPr>
+                <w:lang w:val="en-US"/>
+              </w:rPr>
+            </w:pPr>
+            <w:r>
+              <w:rPr>
+                <w:lang w:val="en-US"/>
+              </w:rPr>
+              <w:t>False</w:t>
+            </w:r>
+          </w:p>
+        </w:tc>
+        <w:tc>
+          <w:tcPr>
+            <w:tcW w:w="5193" w:type="dxa"/>
+          </w:tcPr>
+          <w:p>
+            <w:pPr>
+              <w:cnfStyle w:val="000000000000" w:firstRow="0" w:lastRow="0" w:firstColumn="0" w:lastColumn="0" w:oddVBand="0" w:evenVBand="0" w:oddHBand="0" w:evenHBand="0" w:firstRowFirstColumn="0" w:firstRowLastColumn="0" w:lastRowFirstColumn="0" w:lastRowLastColumn="0"/>
+              <w:rPr>
+                <w:lang w:val="en-US"/>
+              </w:rPr>
+            </w:pPr>
+            <w:r>
+              <w:rPr>
+                <w:lang w:val="en-US"/>
+              </w:rPr>
+              <w:t>2 is greater than 1 but 5.7 isn’t equal to 6</w:t>
+            </w:r>
+          </w:p>
+        </w:tc>
+      </w:tr>
+      <w:tr>
+        <w:tc>
+          <w:tcPr>
+            <w:cnfStyle w:val="001000000000" w:firstRow="0" w:lastRow="0" w:firstColumn="1" w:lastColumn="0" w:oddVBand="0" w:evenVBand="0" w:oddHBand="0" w:evenHBand="0" w:firstRowFirstColumn="0" w:firstRowLastColumn="0" w:lastRowFirstColumn="0" w:lastRowLastColumn="0"/>
+            <w:tcW w:w="2263" w:type="dxa"/>
+          </w:tcPr>
+          <w:p>
+            <w:pPr>
+              <w:rPr>
+                <w:b w:val="0"/>
+                <w:bCs w:val="0"/>
+                <w:lang w:val="en-US"/>
+              </w:rPr>
+            </w:pPr>
+            <w:r>
+              <w:rPr>
+                <w:b w:val="0"/>
+                <w:bCs w:val="0"/>
+                <w:lang w:val="en-US"/>
+              </w:rPr>
+              <w:t>y &lt; 10 or z &gt; 1</w:t>
+            </w:r>
+          </w:p>
+        </w:tc>
+        <w:tc>
+          <w:tcPr>
+            <w:tcW w:w="1560" w:type="dxa"/>
+          </w:tcPr>
+          <w:p>
+            <w:pPr>
+              <w:cnfStyle w:val="000000000000" w:firstRow="0" w:lastRow="0" w:firstColumn="0" w:lastColumn="0" w:oddVBand="0" w:evenVBand="0" w:oddHBand="0" w:evenHBand="0" w:firstRowFirstColumn="0" w:firstRowLastColumn="0" w:lastRowFirstColumn="0" w:lastRowLastColumn="0"/>
+              <w:rPr>
+                <w:lang w:val="en-US"/>
+              </w:rPr>
+            </w:pPr>
+            <w:r>
+              <w:rPr>
+                <w:lang w:val="en-US"/>
+              </w:rPr>
+              <w:t>True</w:t>
+            </w:r>
+          </w:p>
+        </w:tc>
+        <w:tc>
+          <w:tcPr>
+            <w:tcW w:w="5193" w:type="dxa"/>
+          </w:tcPr>
+          <w:p>
+            <w:pPr>
+              <w:cnfStyle w:val="000000000000" w:firstRow="0" w:lastRow="0" w:firstColumn="0" w:lastColumn="0" w:oddVBand="0" w:evenVBand="0" w:oddHBand="0" w:evenHBand="0" w:firstRowFirstColumn="0" w:firstRowLastColumn="0" w:lastRowFirstColumn="0" w:lastRowLastColumn="0"/>
+              <w:rPr>
+                <w:lang w:val="en-US"/>
+              </w:rPr>
+            </w:pPr>
+            <w:r>
+              <w:rPr>
+                <w:lang w:val="en-US"/>
+              </w:rPr>
+              <w:t>5.7 is less than 10 thus True</w:t>
+            </w:r>
+          </w:p>
+        </w:tc>
+      </w:tr>
+      <w:tr>
+        <w:tc>
+          <w:tcPr>
+            <w:cnfStyle w:val="001000000000" w:firstRow="0" w:lastRow="0" w:firstColumn="1" w:lastColumn="0" w:oddVBand="0" w:evenVBand="0" w:oddHBand="0" w:evenHBand="0" w:firstRowFirstColumn="0" w:firstRowLastColumn="0" w:lastRowFirstColumn="0" w:lastRowLastColumn="0"/>
+            <w:tcW w:w="2263" w:type="dxa"/>
+          </w:tcPr>
+          <w:p>
+            <w:pPr>
+              <w:rPr>
+                <w:b w:val="0"/>
+                <w:bCs w:val="0"/>
+                <w:lang w:val="en-US"/>
+              </w:rPr>
+            </w:pPr>
+            <w:r>
+              <w:rPr>
+                <w:b w:val="0"/>
+                <w:bCs w:val="0"/>
+                <w:lang w:val="en-US"/>
+              </w:rPr>
+              <w:t>a = y &gt;= 5</w:t>
+            </w:r>
+          </w:p>
+        </w:tc>
+        <w:tc>
+          <w:tcPr>
+            <w:tcW w:w="1560" w:type="dxa"/>
+          </w:tcPr>
+          <w:p>
+            <w:pPr>
+              <w:cnfStyle w:val="000000000000" w:firstRow="0" w:lastRow="0" w:firstColumn="0" w:lastColumn="0" w:oddVBand="0" w:evenVBand="0" w:oddHBand="0" w:evenHBand="0" w:firstRowFirstColumn="0" w:firstRowLastColumn="0" w:lastRowFirstColumn="0" w:lastRowLastColumn="0"/>
+              <w:rPr>
+                <w:lang w:val="en-US"/>
+              </w:rPr>
+            </w:pPr>
+            <w:r>
+              <w:rPr>
+                <w:lang w:val="en-US"/>
+              </w:rPr>
+              <w:t>ERROR</w:t>
+            </w:r>
+          </w:p>
+        </w:tc>
+        <w:tc>
+          <w:tcPr>
+            <w:tcW w:w="5193" w:type="dxa"/>
+          </w:tcPr>
+          <w:p>
+            <w:pPr>
+              <w:cnfStyle w:val="000000000000" w:firstRow="0" w:lastRow="0" w:firstColumn="0" w:lastColumn="0" w:oddVBand="0" w:evenVBand="0" w:oddHBand="0" w:evenHBand="0" w:firstRowFirstColumn="0" w:firstRowLastColumn="0" w:lastRowFirstColumn="0" w:lastRowLastColumn="0"/>
+              <w:rPr>
+                <w:lang w:val="en-US"/>
+              </w:rPr>
+            </w:pPr>
+            <w:r>
+              <w:rPr>
+                <w:lang w:val="en-US"/>
+              </w:rPr>
+              <w:t>the variable a is undefined</w:t>
+            </w:r>
+          </w:p>
+        </w:tc>
+      </w:tr>
+    </w:tbl>
+    <w:p>
+      <w:pPr>
+        <w:pStyle w:val="Heading2"/>
+        <w:rPr>
+          <w:lang w:val="en-US"/>
+        </w:rPr>
+      </w:pPr>
+      <w:r>
+        <w:rPr>
+          <w:lang w:val="en-US"/>
+        </w:rPr>
+        <w:t>Exercise 4</w:t>
+      </w:r>
+    </w:p>
+    <w:p>
+      <w:pPr>
+        <w:rPr>
+          <w:lang w:val="en-US"/>
+        </w:rPr>
+      </w:pPr>
+      <w:r>
+        <w:rPr>
+          <w:noProof/>
+          <w:lang w:val="en-US"/>
+        </w:rPr>
+        <w:drawing>
+          <wp:inline distT="0" distB="0" distL="0" distR="0" wp14:anchorId="3145576D" wp14:editId="3D205C34">
+            <wp:extent cx="5731510" cy="432435"/>
+            <wp:effectExtent l="0" t="0" r="0" b="0"/>
+            <wp:docPr id="474004953" name="Picture 2"/>
+            <wp:cNvGraphicFramePr>
+              <a:graphicFrameLocks xmlns:a="http://schemas.openxmlformats.org/drawingml/2006/main" noChangeAspect="1"/>
+            </wp:cNvGraphicFramePr>
+            <a:graphic xmlns:a="http://schemas.openxmlformats.org/drawingml/2006/main">
+              <a:graphicData uri="http://schemas.openxmlformats.org/drawingml/2006/picture">
+                <pic:pic xmlns:pic="http://schemas.openxmlformats.org/drawingml/2006/picture">
+                  <pic:nvPicPr>
+                    <pic:cNvPr id="474004953" name="Picture 474004953"/>
+                    <pic:cNvPicPr/>
+                  </pic:nvPicPr>
+                  <pic:blipFill>
+                    <a:blip r:embed="rId4">
+                      <a:extLst>
+                        <a:ext uri="{28A0092B-C50C-407E-A947-70E740481C1C}">
+                          <a14:useLocalDpi xmlns:a14="http://schemas.microsoft.com/office/drawing/2010/main" val="0"/>
+                        </a:ext>
+                      </a:extLst>
+                    </a:blip>
+                    <a:stretch>
+                      <a:fillRect/>
+                    </a:stretch>
+                  </pic:blipFill>
+                  <pic:spPr>
+                    <a:xfrm>
+                      <a:off x="0" y="0"/>
+                      <a:ext cx="5731510" cy="432435"/>
+                    </a:xfrm>
+                    <a:prstGeom prst="rect">
+                      <a:avLst/>
+                    </a:prstGeom>
+                  </pic:spPr>
+                </pic:pic>
+              </a:graphicData>
+            </a:graphic>
+          </wp:inline>
+        </w:drawing>
+      </w:r>
+    </w:p>
+    <w:p>
+      <w:pPr>
+        <w:rPr>
+          <w:lang w:val="en-US"/>
+        </w:rPr>
+      </w:pPr>
+      <w:r>
+        <w:rPr>
+          <w:lang w:val="en-US"/>
+        </w:rPr>
+        <w:t>Output:</w:t>
+      </w:r>
+      <w:r>
+        <w:rPr>
+          <w:lang w:val="en-US"/>
+        </w:rPr>
+        <w:t xml:space="preserve"> </w:t>
+      </w:r>
+      <w:r>
+        <w:rPr>
+          <w:i/>
+          <w:iCs/>
+          <w:lang w:val="en-US"/>
+        </w:rPr>
+        <w:t>The remainer of 15 when divided by two is 1</w:t>
+      </w:r>
+    </w:p>
+    <w:p>
+      <w:pPr>
+        <w:pStyle w:val="Heading2"/>
+        <w:rPr>
+          <w:lang w:val="en-US"/>
+        </w:rPr>
+      </w:pPr>
+      <w:r>
+        <w:rPr>
+          <w:lang w:val="en-US"/>
+        </w:rPr>
+        <w:lastRenderedPageBreak/>
+        <w:t>Exercise 5</w:t>
+      </w:r>
+    </w:p>
+    <w:p>
+      <w:pPr>
+        <w:rPr>
+          <w:lang w:val="en-US"/>
+        </w:rPr>
+      </w:pPr>
+      <w:r>
+        <w:rPr>
+          <w:noProof/>
+          <w:lang w:val="en-US"/>
+        </w:rPr>
+        <w:drawing>
+          <wp:inline distT="0" distB="0" distL="0" distR="0" wp14:anchorId="6D6DBBD5" wp14:editId="148E05EB">
+            <wp:extent cx="2311400" cy="482600"/>
+            <wp:effectExtent l="0" t="0" r="0" b="0"/>
+            <wp:docPr id="757752622" name="Picture 3"/>
+            <wp:cNvGraphicFramePr>
+              <a:graphicFrameLocks xmlns:a="http://schemas.openxmlformats.org/drawingml/2006/main" noChangeAspect="1"/>
+            </wp:cNvGraphicFramePr>
+            <a:graphic xmlns:a="http://schemas.openxmlformats.org/drawingml/2006/main">
+              <a:graphicData uri="http://schemas.openxmlformats.org/drawingml/2006/picture">
+                <pic:pic xmlns:pic="http://schemas.openxmlformats.org/drawingml/2006/picture">
+                  <pic:nvPicPr>
+                    <pic:cNvPr id="757752622" name="Picture 757752622"/>
+                    <pic:cNvPicPr/>
+                  </pic:nvPicPr>
+                  <pic:blipFill>
+                    <a:blip r:embed="rId5">
+                      <a:extLst>
+                        <a:ext uri="{28A0092B-C50C-407E-A947-70E740481C1C}">
+                          <a14:useLocalDpi xmlns:a14="http://schemas.microsoft.com/office/drawing/2010/main" val="0"/>
+                        </a:ext>
+                      </a:extLst>
+                    </a:blip>
+                    <a:stretch>
+                      <a:fillRect/>
+                    </a:stretch>
+                  </pic:blipFill>
+                  <pic:spPr>
+                    <a:xfrm>
+                      <a:off x="0" y="0"/>
+                      <a:ext cx="2311400" cy="482600"/>
+                    </a:xfrm>
+                    <a:prstGeom prst="rect">
+                      <a:avLst/>
+                    </a:prstGeom>
+                  </pic:spPr>
+                </pic:pic>
+              </a:graphicData>
+            </a:graphic>
+          </wp:inline>
+        </w:drawing>
+      </w:r>
+    </w:p>
+    <w:p>
+      <w:pPr>
+        <w:rPr>
+          <w:i/>
+          <w:iCs/>
+          <w:lang w:val="en-US"/>
+        </w:rPr>
+      </w:pPr>
+      <w:r>
+        <w:rPr>
+          <w:lang w:val="en-US"/>
+        </w:rPr>
+        <w:t xml:space="preserve">Output: </w:t>
+      </w:r>
+      <w:r>
+        <w:rPr>
+          <w:i/>
+          <w:iCs/>
+          <w:lang w:val="en-US"/>
+        </w:rPr>
+        <w:t>1.97931859e+08</w:t>
+      </w:r>
+    </w:p>
+    <w:p>
+      <w:pPr>
+        <w:pStyle w:val="Heading2"/>
+        <w:rPr>
+          <w:lang w:val="en-US"/>
+        </w:rPr>
+      </w:pPr>
+      <w:r>
+        <w:rPr>
+          <w:lang w:val="en-US"/>
+        </w:rPr>
+        <w:t>Exercise 6</w:t>
       </w:r>
     </w:p>
     <w:p>

</xml_diff>